<commit_message>
docs: dong bo bao cao WEEK04 theo ban chinh sua + sua loi export bang
- Bo hai muc 'Kho khan' / 'Cau hoi can TA' khoi Tom tat nhanh
- Tach '=> Ket luan' thanh muc 2 rieng trong danh sach lech Outline
- Xoa 4.4 (hai cau hoi treo voi BTC) va 5.3 (venue du kien); danh so lai 4.5 -> 4.4
- Bo emoji va dau tick trong bang tuan
- Go hai tham chieu treo den 'venue du kien' o muc 2 va bang muc 7
- export_progress_report.py: split_row khong con vo dong bang khi o chua \|
- Cap nhat lai URL repo thanh CapyAura trong ban .docx
</commit_message>
<xml_diff>
--- a/Slot 1/Working Files/Báo cáo/WEEK04 - Báo cáo tổng kết.docx
+++ b/Slot 1/Working Files/Báo cáo/WEEK04 - Báo cáo tổng kết.docx
@@ -51,7 +51,7 @@
         <w:t>Mã nguồn:</w:t>
       </w:r>
       <w:r>
-        <w:t xml:space="preserve"> https://github.com/AIVIETNAM-AIO-namht/docvqa-baseline-to-ablation</w:t>
+        <w:t xml:space="preserve"> https://github.com/CapyAura/docvqa-baseline-to-ablation</w:t>
       </w:r>
     </w:p>
     <w:p>
@@ -170,43 +170,6 @@
           <w:b/>
         </w:rPr>
         <w:t>Cấu hình D: kết luận âm ở zero-shot (0,578 so với 0,818), nhưng phép thử cuối lật ngược kết luận về tín hiệu — bộ đọc tuyến tính trên ViT đóng băng đạt 100,0% trên 120 câu.</w:t>
-      </w:r>
-    </w:p>
-    <w:p>
-      <w:pPr>
-        <w:pStyle w:val="ListBullet"/>
-      </w:pPr>
-      <w:r>
-        <w:rPr>
-          <w:b/>
-        </w:rPr>
-        <w:t>Khó khăn đang gặp:</w:t>
-      </w:r>
-      <w:r>
-        <w:t xml:space="preserve"> hai câu hỏi treo với BTC chưa được trả lời (§4.4); bộ định tuyến intent dựa trên template train — rủi ro chưa đo được (§4.2).</w:t>
-      </w:r>
-    </w:p>
-    <w:p>
-      <w:pPr>
-        <w:pStyle w:val="ListBullet"/>
-      </w:pPr>
-      <w:r>
-        <w:rPr>
-          <w:b/>
-        </w:rPr>
-        <w:t>Câu hỏi cần TA hỗ trợ:</w:t>
-      </w:r>
-      <w:r>
-        <w:t xml:space="preserve"> gửi riêng qua </w:t>
-      </w:r>
-      <w:r>
-        <w:rPr>
-          <w:b/>
-        </w:rPr>
-        <w:t>form đặt câu hỏi cho TA</w:t>
-      </w:r>
-      <w:r>
-        <w:t xml:space="preserve"> (quy ước từ WEEK02), không ghi trong báo cáo này.</w:t>
       </w:r>
     </w:p>
     <w:p>
@@ -606,7 +569,7 @@
           <w:p>
             <w:r/>
             <w:r>
-              <w:t>✅ hoàn thành</w:t>
+              <w:t>hoàn thành</w:t>
             </w:r>
           </w:p>
         </w:tc>
@@ -641,7 +604,7 @@
           <w:p>
             <w:r/>
             <w:r>
-              <w:t>✅ hoàn thành — B = 0,968</w:t>
+              <w:t>hoàn thành — B = 0,968</w:t>
             </w:r>
           </w:p>
         </w:tc>
@@ -675,9 +638,6 @@
           </w:tcPr>
           <w:p>
             <w:r/>
-            <w:r>
-              <w:t xml:space="preserve">⚠️ </w:t>
-            </w:r>
             <w:r>
               <w:rPr>
                 <w:b/>
@@ -720,7 +680,7 @@
           <w:p>
             <w:r/>
             <w:r>
-              <w:t>✅ hoàn thành — báo cáo này</w:t>
+              <w:t>hoàn thành</w:t>
             </w:r>
           </w:p>
         </w:tc>
@@ -738,7 +698,7 @@
         <w:t>chuẩn hóa mã nguồn</w:t>
       </w:r>
       <w:r>
-        <w:t xml:space="preserve"> (✅), </w:t>
+        <w:t xml:space="preserve">, </w:t>
       </w:r>
       <w:r>
         <w:rPr>
@@ -747,7 +707,7 @@
         <w:t>truy vết số liệu</w:t>
       </w:r>
       <w:r>
-        <w:t xml:space="preserve"> (✅ — bảng ở §6), </w:t>
+        <w:t xml:space="preserve"> (bảng ở §6), </w:t>
       </w:r>
       <w:r>
         <w:rPr>
@@ -756,7 +716,7 @@
         <w:t>draft paper</w:t>
       </w:r>
       <w:r>
-        <w:t xml:space="preserve"> (✅ — báo cáo này đóng vai bản draft; §5 nêu venue dự kiến).</w:t>
+        <w:t xml:space="preserve"> — báo cáo này đóng vai bản draft.</w:t>
       </w:r>
     </w:p>
     <w:p>
@@ -764,7 +724,7 @@
         <w:rPr>
           <w:b/>
         </w:rPr>
-        <w:t>Hai chỗ lệch so với Outline, và lý do:</w:t>
+        <w:t>Ba chỗ lệch so với Outline, và lý do:</w:t>
       </w:r>
     </w:p>
     <w:p>
@@ -805,16 +765,21 @@
         <w:t>0 họ chạm trần</w:t>
       </w:r>
       <w:r>
-        <w:t xml:space="preserve">. Kết luận: loại tín hiệu mà LayoutLMv3 sinh ra để khai thác </w:t>
-      </w:r>
+        <w:t>.</w:t>
+      </w:r>
+    </w:p>
+    <w:p>
+      <w:pPr>
+        <w:pStyle w:val="ListNumber"/>
+      </w:pPr>
       <w:r>
         <w:rPr>
           <w:b/>
         </w:rPr>
-        <w:t>không tồn tại</w:t>
-      </w:r>
-      <w:r>
-        <w:t xml:space="preserve"> trong dữ liệu này (hình học hàng đồng nhất tuyệt đối — cao độ 0,02121 ở mọi hàng, khe hở 0,00000).</w:t>
+        <w:t>⇒ Kết luận: loại tín hiệu mà LayoutLMv3 sinh ra để khai thác không tồn tại trong dữ liệu này</w:t>
+      </w:r>
+      <w:r>
+        <w:t xml:space="preserve"> (hình học hàng đồng nhất tuyệt đối — cao độ 0,02121 ở mọi hàng, khe hở 0,00000).</w:t>
       </w:r>
     </w:p>
     <w:p>
@@ -3282,7 +3247,7 @@
           <w:p>
             <w:r/>
             <w:r>
-              <w:t>Bỏ 20 / 200 chiều \</w:t>
+              <w:t>Bỏ 20 / 200 chiều |w| lớn nhất</w:t>
             </w:r>
           </w:p>
         </w:tc>
@@ -3293,7 +3258,7 @@
           <w:p>
             <w:r/>
             <w:r>
-              <w:t>w\</w:t>
+              <w:t>vẫn 100% ⇒ trọng số trải đều</w:t>
             </w:r>
           </w:p>
         </w:tc>
@@ -3848,80 +3813,7 @@
         <w:pStyle w:val="Heading3"/>
       </w:pPr>
       <w:r>
-        <w:t>4.4. Hai câu hỏi treo với BTC chưa được trả lời</w:t>
-      </w:r>
-    </w:p>
-    <w:p>
-      <w:pPr>
-        <w:pStyle w:val="ListBullet"/>
-      </w:pPr>
-      <w:r>
-        <w:rPr>
-          <w:b/>
-        </w:rPr>
-        <w:t>Quy ước `page` khi nộp file</w:t>
-      </w:r>
-      <w:r>
-        <w:t xml:space="preserve"> (</w:t>
-      </w:r>
-      <w:r>
-        <w:rPr>
-          <w:rFonts w:ascii="Consolas" w:hAnsi="Consolas"/>
-          <w:color w:val="A31D1D"/>
-          <w:sz w:val="19"/>
-        </w:rPr>
-        <w:t>labels.jsonl</w:t>
-      </w:r>
-      <w:r>
-        <w:t xml:space="preserve"> dùng 1-based) — treo từ WEEK01. Ảnh hưởng trực tiếp tới 15% điểm (Evidence-F1).</w:t>
-      </w:r>
-    </w:p>
-    <w:p>
-      <w:pPr>
-        <w:pStyle w:val="ListBullet"/>
-      </w:pPr>
-      <w:r>
-        <w:rPr>
-          <w:b/>
-        </w:rPr>
-        <w:t>Thu hẹp C/D vào 3 dạng còn dư địa có còn đủ để gọi là ablation A/B/C/D đầy đủ không.</w:t>
-      </w:r>
-      <w:r>
-        <w:t xml:space="preserve"> Về phía tôi, câu trả lời là có: bốn cấu hình trả lời bốn câu hỏi khác nhau, và mỗi cấu hình đều được đo trên </w:t>
-      </w:r>
-      <w:r>
-        <w:rPr>
-          <w:b/>
-        </w:rPr>
-        <w:t>toàn bộ</w:t>
-      </w:r>
-      <w:r>
-        <w:t xml:space="preserve"> 11.000 câu khi đo trần — chỉ phần </w:t>
-      </w:r>
-      <w:r>
-        <w:rPr>
-          <w:i/>
-        </w:rPr>
-        <w:t>dựng model</w:t>
-      </w:r>
-      <w:r>
-        <w:t xml:space="preserve"> mới thu hẹp vào dạng có dư địa.</w:t>
-      </w:r>
-    </w:p>
-    <w:p>
-      <w:r>
-        <w:rPr>
-          <w:i/>
-        </w:rPr>
-        <w:t>(Câu hỏi thứ ba — định nghĩa Evidence-F1 — đã được BTC trả lời ngày 2026-10-07: one-to-one, IoU ≥ 0,5, Hungarian hoặc greedy đều được nếu nhất quán, box thừa bị phạt qua precision. Đo thêm: tham lam ≡ tối ưu trên 11.000 câu; `evidence_f1.py` đã đúng y hệt từ đầu.)</w:t>
-      </w:r>
-    </w:p>
-    <w:p>
-      <w:pPr>
-        <w:pStyle w:val="Heading3"/>
-      </w:pPr>
-      <w:r>
-        <w:t>4.5. Điểm mất còn lại không có hướng khắc phục trong phạm vi dữ liệu</w:t>
+        <w:t>4.4. Điểm mất còn lại không có hướng khắc phục trong phạm vi dữ liệu</w:t>
       </w:r>
     </w:p>
     <w:p>
@@ -4182,315 +4074,6 @@
       </w:r>
       <w:r>
         <w:t>, nên không có chuyện "kết quả âm rồi mới biện luận". Với các bài toán mà chi phí bậc sau gấp hàng chục lần bậc trước, đây là kỷ luật nên chuẩn hóa.</w:t>
-      </w:r>
-    </w:p>
-    <w:p>
-      <w:pPr>
-        <w:pStyle w:val="Heading3"/>
-      </w:pPr>
-      <w:r>
-        <w:t>5.3. Venue dự kiến</w:t>
-      </w:r>
-    </w:p>
-    <w:p>
-      <w:r>
-        <w:t xml:space="preserve">Hướng hiện tại phù hợp với nhóm hội nghị/tạp chí về </w:t>
-      </w:r>
-      <w:r>
-        <w:rPr>
-          <w:b/>
-        </w:rPr>
-        <w:t>phân tích tài liệu</w:t>
-      </w:r>
-      <w:r>
-        <w:t xml:space="preserve"> (document analysis) hơn là học sâu tổng quát, vì đóng góp là đo lường + phương pháp đánh giá chứ không phải kiến trúc mới:</w:t>
-      </w:r>
-    </w:p>
-    <w:tbl>
-      <w:tblPr>
-        <w:tblStyle w:val="TableGrid"/>
-        <w:tblW w:type="auto" w:w="0"/>
-        <w:jc w:val="center"/>
-        <w:tblLook w:firstColumn="1" w:firstRow="1" w:lastColumn="0" w:lastRow="0" w:noHBand="0" w:noVBand="1" w:val="04A0"/>
-      </w:tblPr>
-      <w:tblGrid>
-        <w:gridCol w:w="2880"/>
-        <w:gridCol w:w="2880"/>
-        <w:gridCol w:w="2880"/>
-      </w:tblGrid>
-      <w:tr>
-        <w:tc>
-          <w:tcPr>
-            <w:tcW w:type="dxa" w:w="2880"/>
-            <w:shd w:val="clear" w:fill="D9E2F3"/>
-          </w:tcPr>
-          <w:p>
-            <w:r>
-              <w:rPr>
-                <w:b/>
-              </w:rPr>
-            </w:r>
-            <w:r>
-              <w:rPr>
-                <w:b/>
-              </w:rPr>
-              <w:t>Venue</w:t>
-            </w:r>
-          </w:p>
-        </w:tc>
-        <w:tc>
-          <w:tcPr>
-            <w:tcW w:type="dxa" w:w="2880"/>
-            <w:shd w:val="clear" w:fill="D9E2F3"/>
-          </w:tcPr>
-          <w:p>
-            <w:r>
-              <w:rPr>
-                <w:b/>
-              </w:rPr>
-            </w:r>
-            <w:r>
-              <w:rPr>
-                <w:b/>
-              </w:rPr>
-              <w:t>Loại</w:t>
-            </w:r>
-          </w:p>
-        </w:tc>
-        <w:tc>
-          <w:tcPr>
-            <w:tcW w:type="dxa" w:w="2880"/>
-            <w:shd w:val="clear" w:fill="D9E2F3"/>
-          </w:tcPr>
-          <w:p>
-            <w:r>
-              <w:rPr>
-                <w:b/>
-              </w:rPr>
-            </w:r>
-            <w:r>
-              <w:rPr>
-                <w:b/>
-              </w:rPr>
-              <w:t>Vì sao phù hợp</w:t>
-            </w:r>
-          </w:p>
-        </w:tc>
-      </w:tr>
-      <w:tr>
-        <w:tc>
-          <w:tcPr>
-            <w:tcW w:type="dxa" w:w="2880"/>
-          </w:tcPr>
-          <w:p>
-            <w:r/>
-            <w:r>
-              <w:rPr>
-                <w:b/>
-              </w:rPr>
-              <w:t>ICDAR</w:t>
-            </w:r>
-          </w:p>
-        </w:tc>
-        <w:tc>
-          <w:tcPr>
-            <w:tcW w:type="dxa" w:w="2880"/>
-          </w:tcPr>
-          <w:p>
-            <w:r/>
-            <w:r>
-              <w:t>Hội nghị</w:t>
-            </w:r>
-          </w:p>
-        </w:tc>
-        <w:tc>
-          <w:tcPr>
-            <w:tcW w:type="dxa" w:w="2880"/>
-          </w:tcPr>
-          <w:p>
-            <w:r/>
-            <w:r>
-              <w:t xml:space="preserve">Hội nghị chuyên ngành chính về document analysis; </w:t>
-            </w:r>
-            <w:r>
-              <w:rPr>
-                <w:rFonts w:ascii="Consolas" w:hAnsi="Consolas"/>
-                <w:color w:val="A31D1D"/>
-                <w:sz w:val="19"/>
-              </w:rPr>
-              <w:t>argmax</w:t>
-            </w:r>
-            <w:r>
-              <w:t>/</w:t>
-            </w:r>
-            <w:r>
-              <w:rPr>
-                <w:rFonts w:ascii="Consolas" w:hAnsi="Consolas"/>
-                <w:color w:val="A31D1D"/>
-                <w:sz w:val="19"/>
-              </w:rPr>
-              <w:t>argmin</w:t>
-            </w:r>
-            <w:r>
-              <w:t xml:space="preserve"> trên lưới OCR là đúng phạm vi</w:t>
-            </w:r>
-          </w:p>
-        </w:tc>
-      </w:tr>
-      <w:tr>
-        <w:tc>
-          <w:tcPr>
-            <w:tcW w:type="dxa" w:w="2880"/>
-          </w:tcPr>
-          <w:p>
-            <w:r/>
-            <w:r>
-              <w:rPr>
-                <w:b/>
-              </w:rPr>
-              <w:t>IJDAR</w:t>
-            </w:r>
-          </w:p>
-        </w:tc>
-        <w:tc>
-          <w:tcPr>
-            <w:tcW w:type="dxa" w:w="2880"/>
-          </w:tcPr>
-          <w:p>
-            <w:r/>
-            <w:r>
-              <w:t>Tạp chí</w:t>
-            </w:r>
-          </w:p>
-        </w:tc>
-        <w:tc>
-          <w:tcPr>
-            <w:tcW w:type="dxa" w:w="2880"/>
-          </w:tcPr>
-          <w:p>
-            <w:r/>
-            <w:r>
-              <w:t>Nơi BoundingDocs và LiGT (2 trong 10 paper đã đọc) công bố — cùng chủ đề, cùng loại đóng góp</w:t>
-            </w:r>
-          </w:p>
-        </w:tc>
-      </w:tr>
-      <w:tr>
-        <w:tc>
-          <w:tcPr>
-            <w:tcW w:type="dxa" w:w="2880"/>
-          </w:tcPr>
-          <w:p>
-            <w:r/>
-            <w:r>
-              <w:rPr>
-                <w:b/>
-              </w:rPr>
-              <w:t>DAS</w:t>
-            </w:r>
-          </w:p>
-        </w:tc>
-        <w:tc>
-          <w:tcPr>
-            <w:tcW w:type="dxa" w:w="2880"/>
-          </w:tcPr>
-          <w:p>
-            <w:r/>
-            <w:r>
-              <w:t>Hội nghị</w:t>
-            </w:r>
-          </w:p>
-        </w:tc>
-        <w:tc>
-          <w:tcPr>
-            <w:tcW w:type="dxa" w:w="2880"/>
-          </w:tcPr>
-          <w:p>
-            <w:r/>
-            <w:r>
-              <w:t>Document Analysis Systems — nhánh chuyên về hệ thống và đánh giá</w:t>
-            </w:r>
-          </w:p>
-        </w:tc>
-      </w:tr>
-      <w:tr>
-        <w:tc>
-          <w:tcPr>
-            <w:tcW w:type="dxa" w:w="2880"/>
-          </w:tcPr>
-          <w:p>
-            <w:r/>
-            <w:r>
-              <w:rPr>
-                <w:b/>
-              </w:rPr>
-              <w:t>WACV</w:t>
-            </w:r>
-          </w:p>
-        </w:tc>
-        <w:tc>
-          <w:tcPr>
-            <w:tcW w:type="dxa" w:w="2880"/>
-          </w:tcPr>
-          <w:p>
-            <w:r/>
-            <w:r>
-              <w:t>Hội nghị</w:t>
-            </w:r>
-          </w:p>
-        </w:tc>
-        <w:tc>
-          <w:tcPr>
-            <w:tcW w:type="dxa" w:w="2880"/>
-          </w:tcPr>
-          <w:p>
-            <w:r/>
-            <w:r>
-              <w:t>Nơi DocVQA công bố; phù hợp nếu mở rộng sang phần thị giác</w:t>
-            </w:r>
-          </w:p>
-        </w:tc>
-      </w:tr>
-    </w:tbl>
-    <w:p/>
-    <w:p>
-      <w:r>
-        <w:rPr>
-          <w:b/>
-        </w:rPr>
-        <w:t>Đánh giá thẳng: kết quả hiện tại chưa đủ để submit.</w:t>
-      </w:r>
-      <w:r>
-        <w:t xml:space="preserve"> Ba phần còn thiếu: (a) số đo trên tập đích thay vì chỉ </w:t>
-      </w:r>
-      <w:r>
-        <w:rPr>
-          <w:rFonts w:ascii="Consolas" w:hAnsi="Consolas"/>
-          <w:color w:val="A31D1D"/>
-          <w:sz w:val="19"/>
-        </w:rPr>
-        <w:t>training_set</w:t>
-      </w:r>
-      <w:r>
-        <w:t xml:space="preserve">; (b) mở rộng từ tiếng Việt hành chính sang ít nhất một bộ dữ liệu thứ hai để kết luận có tính tổng quát; (c) so sánh với ít nhất một baseline học sâu </w:t>
-      </w:r>
-      <w:r>
-        <w:rPr>
-          <w:b/>
-        </w:rPr>
-        <w:t>đã huấn luyện</w:t>
-      </w:r>
-      <w:r>
-        <w:t xml:space="preserve"> (không chỉ zero-shot) để kết luận âm đứng vững trước phản biện. Việc chọn venue ở giai đoạn này là để </w:t>
-      </w:r>
-      <w:r>
-        <w:rPr>
-          <w:b/>
-        </w:rPr>
-        <w:t>định hướng</w:t>
-      </w:r>
-      <w:r>
-        <w:t>, đúng như hướng dẫn §III.2.</w:t>
       </w:r>
     </w:p>
     <w:p>
@@ -5739,7 +5322,7 @@
           <w:p>
             <w:r/>
             <w:r>
-              <w:t>Không có số đo trên tập đích; router intent phụ thuộc template train; D′ có khoảng tin cậy ±6–7 điểm; hai câu hỏi treo với BTC (§4)</w:t>
+              <w:t>Không có số đo trên tập đích; router intent phụ thuộc template train; D′ có khoảng tin cậy ±6–7 điểm (§4)</w:t>
             </w:r>
           </w:p>
         </w:tc>
@@ -5763,7 +5346,7 @@
           <w:p>
             <w:r/>
             <w:r>
-              <w:t>Tích hợp bộ đọc tuyến tính vào B; sinh file nộp public_test; ba câu hỏi nghiên cứu; venue dự kiến ICDAR / IJDAR (§5)</w:t>
+              <w:t>Tích hợp bộ đọc tuyến tính vào B; sinh file nộp public_test; ba câu hỏi nghiên cứu (§5)</w:t>
             </w:r>
           </w:p>
         </w:tc>
@@ -5814,7 +5397,7 @@
         <w:pStyle w:val="ListBullet"/>
       </w:pPr>
       <w:r>
-        <w:t>Mã nguồn: https://github.com/AIVIETNAM-AIO-namht/docvqa-baseline-to-ablation</w:t>
+        <w:t>Mã nguồn: https://github.com/CapyAura/docvqa-baseline-to-ablation</w:t>
       </w:r>
     </w:p>
     <w:p>

</xml_diff>